<commit_message>
docs: align zte topic two submission package
</commit_message>
<xml_diff>
--- a/competition/zte/final-package/BugMentor-中兴赛道-合规说明.docx
+++ b/competition/zte/final-package/BugMentor-中兴赛道-合规说明.docx
@@ -38,7 +38,7 @@
           <w:sz w:val="34"/>
           <w:szCs w:val="34"/>
         </w:rPr>
-        <w:t xml:space="preserve">中兴赛道 · 合规说明</w:t>
+        <w:t xml:space="preserve">中兴赛道命题二 · 合规说明</w:t>
       </w:r>
     </w:p>
     <w:p>
@@ -105,7 +105,7 @@
           <w:sz w:val="22"/>
           <w:szCs w:val="22"/>
         </w:rPr>
-        <w:t xml:space="preserve">版本：1.0 · 2026-08-30</w:t>
+        <w:t xml:space="preserve">版本：1.1 · 2026-09-05</w:t>
       </w:r>
     </w:p>
     <w:p>
@@ -151,7 +151,7 @@
         <w:rPr>
           <w:rFonts w:ascii="Microsoft YaHei" w:cs="Microsoft YaHei" w:eastAsia="Microsoft YaHei" w:hAnsi="Microsoft YaHei"/>
         </w:rPr>
-        <w:t xml:space="preserve">参赛命题：专业课助教智能体</w:t>
+        <w:t xml:space="preserve">参赛命题：中兴赛道命题二——专业课助教智能体</w:t>
       </w:r>
     </w:p>
     <w:p>
@@ -173,7 +173,7 @@
         <w:rPr>
           <w:rFonts w:ascii="Microsoft YaHei" w:cs="Microsoft YaHei" w:eastAsia="Microsoft YaHei" w:hAnsi="Microsoft YaHei"/>
         </w:rPr>
-        <w:t xml:space="preserve">学校：南京理工大学 日期：2026-08-30</w:t>
+        <w:t xml:space="preserve">学校：南京理工大学 日期：2026-09-05</w:t>
       </w:r>
     </w:p>
     <w:p>
@@ -608,7 +608,7 @@
         <w:rPr>
           <w:rFonts w:ascii="Microsoft YaHei" w:cs="Microsoft YaHei" w:eastAsia="Microsoft YaHei" w:hAnsi="Microsoft YaHei"/>
         </w:rPr>
-        <w:t xml:space="preserve">本人确认以上说明与 2026-08-30 的公开版本和源代码一致。正式提交后如产品功能或第三方服务发生变化，将同步更新本说明。</w:t>
+        <w:t xml:space="preserve">本人确认以上说明与 2026-09-05 的公开版本和源代码一致。正式提交后如产品功能或第三方服务发生变化，将同步更新本说明。本文是项目合规说明，不能替代赛事官方《合规承诺书》；官方承诺书须由负责人亲笔签名并填写实际签署日期。</w:t>
       </w:r>
     </w:p>
     <w:p>

</xml_diff>